<commit_message>
Generar las dos ordenes por defecto: olvidarse del --finde era el error facil
</commit_message>
<xml_diff>
--- a/anexo_imagenes_FINDE.docx
+++ b/anexo_imagenes_FINDE.docx
@@ -1,6 +1,6 @@
 
 <file path=word/document.xml><?xml version="1.0" encoding="utf-8"?>
-<w:document xmlns:wpc="http://schemas.microsoft.com/office/word/2010/wordprocessingCanvas" xmlns:cx="http://schemas.microsoft.com/office/drawing/2014/chartex" xmlns:cx1="http://schemas.microsoft.com/office/drawing/2015/9/8/chartex" xmlns:cx2="http://schemas.microsoft.com/office/drawing/2015/10/21/chartex" xmlns:cx3="http://schemas.microsoft.com/office/drawing/2016/5/9/chartex" xmlns:cx4="http://schemas.microsoft.com/office/drawing/2016/5/10/chartex" xmlns:cx5="http://schemas.microsoft.com/office/drawing/2016/5/11/chartex" xmlns:cx6="http://schemas.microsoft.com/office/drawing/2016/5/12/chartex" xmlns:cx7="http://schemas.microsoft.com/office/drawing/2016/5/13/chartex" xmlns:cx8="http://schemas.microsoft.com/office/drawing/2016/5/14/chartex" xmlns:mc="http://schemas.openxmlformats.org/markup-compatibility/2006" xmlns:aink="http://schemas.microsoft.com/office/drawing/2016/ink" xmlns:am3d="http://schemas.microsoft.com/office/drawing/2017/model3d" xmlns:o="urn:schemas-microsoft-com:office:office" xmlns:oel="http://schemas.microsoft.com/office/2019/extlst" xmlns:r="http://schemas.openxmlformats.org/officeDocument/2006/relationships" xmlns:m="http://schemas.openxmlformats.org/officeDocument/2006/math" xmlns:v="urn:schemas-microsoft-com:vml" xmlns:wp14="http://schemas.microsoft.com/office/word/2010/wordprocessingDrawing" xmlns:wp="http://schemas.openxmlformats.org/drawingml/2006/wordprocessingDrawing" xmlns:w10="urn:schemas-microsoft-com:office:word" xmlns:w="http://schemas.openxmlformats.org/wordprocessingml/2006/main" xmlns:w14="http://schemas.microsoft.com/office/word/2010/wordml" xmlns:w15="http://schemas.microsoft.com/office/word/2012/wordml" xmlns:w16cex="http://schemas.microsoft.com/office/word/2018/wordml/cex" xmlns:w16cid="http://schemas.microsoft.com/office/word/2016/wordml/cid" xmlns:w16="http://schemas.microsoft.com/office/word/2018/wordml" xmlns:w16du="http://schemas.microsoft.com/office/word/2023/wordml/word16du" xmlns:w16sdtdh="http://schemas.microsoft.com/office/word/2020/wordml/sdtdatahash" xmlns:w16se="http://schemas.microsoft.com/office/word/2015/wordml/symex" xmlns:wpg="http://schemas.microsoft.com/office/word/2010/wordprocessingGroup" xmlns:wpi="http://schemas.microsoft.com/office/word/2010/wordprocessingInk" xmlns:wne="http://schemas.microsoft.com/office/word/2006/wordml" xmlns:wps="http://schemas.microsoft.com/office/word/2010/wordprocessingShape" mc:Ignorable="w14 w15 w16se w16cid w16 w16cex w16sdtdh w16du wp14">
+<w:document xmlns:wpc="http://schemas.microsoft.com/office/word/2010/wordprocessingCanvas" xmlns:cx="http://schemas.microsoft.com/office/drawing/2014/chartex" xmlns:cx1="http://schemas.microsoft.com/office/drawing/2015/9/8/chartex" xmlns:cx2="http://schemas.microsoft.com/office/drawing/2015/10/21/chartex" xmlns:cx3="http://schemas.microsoft.com/office/drawing/2016/5/9/chartex" xmlns:cx4="http://schemas.microsoft.com/office/drawing/2016/5/10/chartex" xmlns:cx5="http://schemas.microsoft.com/office/drawing/2016/5/11/chartex" xmlns:cx6="http://schemas.microsoft.com/office/drawing/2016/5/12/chartex" xmlns:cx7="http://schemas.microsoft.com/office/drawing/2016/5/13/chartex" xmlns:cx8="http://schemas.microsoft.com/office/drawing/2016/5/14/chartex" xmlns:mc="http://schemas.openxmlformats.org/markup-compatibility/2006" xmlns:aink="http://schemas.microsoft.com/office/drawing/2016/ink" xmlns:am3d="http://schemas.microsoft.com/office/drawing/2017/model3d" xmlns:o="urn:schemas-microsoft-com:office:office" xmlns:oel="http://schemas.microsoft.com/office/2019/extlst" xmlns:r="http://schemas.openxmlformats.org/officeDocument/2006/relationships" xmlns:m="http://schemas.openxmlformats.org/officeDocument/2006/math" xmlns:v="urn:schemas-microsoft-com:vml" xmlns:wp14="http://schemas.microsoft.com/office/word/2010/wordprocessingDrawing" xmlns:wp="http://schemas.openxmlformats.org/drawingml/2006/wordprocessingDrawing" xmlns:w10="urn:schemas-microsoft-com:office:word" xmlns:w="http://schemas.openxmlformats.org/wordprocessingml/2006/main" xmlns:w14="http://schemas.microsoft.com/office/word/2010/wordml" xmlns:w15="http://schemas.microsoft.com/office/word/2012/wordml" xmlns:w16cex="http://schemas.microsoft.com/office/word/2018/wordml/cex" xmlns:w16cid="http://schemas.microsoft.com/office/word/2016/wordml/cid" xmlns:w16="http://schemas.microsoft.com/office/word/2018/wordml" xmlns:w16du="http://schemas.microsoft.com/office/word/2023/wordml/word16du" xmlns:w16sdtdh="http://schemas.microsoft.com/office/word/2020/wordml/sdtdatahash" xmlns:w16sdtfl="http://schemas.microsoft.com/office/word/2024/wordml/sdtformatlock" xmlns:w16se="http://schemas.microsoft.com/office/word/2015/wordml/symex" xmlns:wpg="http://schemas.microsoft.com/office/word/2010/wordprocessingGroup" xmlns:wpi="http://schemas.microsoft.com/office/word/2010/wordprocessingInk" xmlns:wne="http://schemas.microsoft.com/office/word/2006/wordml" xmlns:wps="http://schemas.microsoft.com/office/word/2010/wordprocessingShape" mc:Ignorable="w14 w15 w16se w16cid w16 w16cex w16sdtdh w16sdtfl w16du wp14">
   <w:body>
     <w:p>
       <w:r>
@@ -16,7 +16,6 @@
     <w:p>
       <w:r>
         <w:rPr>
-          <w:b w:val="0"/>
           <w:i/>
           <w:color w:val="888888"/>
           <w:sz w:val="18"/>
@@ -24,11 +23,612 @@
         <w:t>{{INSTRUCCIONES}}  Pegá debajo las imágenes del anexo. Todo lo que pongas en este archivo —fotos, textos, tablas— se agrega al final de la Orden de Servicio cuando se corre el generador, y aparece en el índice. El título del anexo lo pone el generador, no hace falta escribirlo. Estos dos párrafos grises llevan la marca {{INSTRUCCIONES}} y no se copian: dejalos donde están.</w:t>
       </w:r>
     </w:p>
+    <w:p>
+      <w:pPr>
+        <w:rPr>
+          <w:b/>
+          <w:bCs/>
+          <w:sz w:val="28"/>
+          <w:szCs w:val="28"/>
+        </w:rPr>
+      </w:pPr>
+    </w:p>
+    <w:p>
+      <w:pPr>
+        <w:spacing w:line="240" w:lineRule="auto"/>
+        <w:jc w:val="center"/>
+        <w:rPr>
+          <w:rFonts w:eastAsia="Times New Roman"/>
+          <w:b/>
+          <w:bCs/>
+          <w:color w:val="000000"/>
+          <w:sz w:val="28"/>
+          <w:szCs w:val="28"/>
+          <w:lang w:val="es-AR"/>
+        </w:rPr>
+      </w:pPr>
+      <w:r>
+        <w:rPr>
+          <w:rFonts w:eastAsia="Times New Roman"/>
+          <w:b/>
+          <w:bCs/>
+          <w:color w:val="000000"/>
+          <w:sz w:val="28"/>
+          <w:szCs w:val="28"/>
+          <w:lang w:val="es-AR"/>
+        </w:rPr>
+        <w:t>DESCONCENTRACION BOCA FINDE</w:t>
+      </w:r>
+    </w:p>
     <w:p/>
+    <w:p>
+      <w:pPr>
+        <w:rPr>
+          <w:lang w:val="es-AR"/>
+        </w:rPr>
+      </w:pPr>
+      <w:r>
+        <w:rPr>
+          <w:lang w:val="es-AR"/>
+        </w:rPr>
+        <w:t xml:space="preserve">                       </w:t>
+      </w:r>
+      <w:r>
+        <w:rPr>
+          <w:noProof/>
+          <w:lang w:val="es-AR"/>
+        </w:rPr>
+        <w:drawing>
+          <wp:inline distT="0" distB="0" distL="0" distR="0" wp14:anchorId="27991B2A" wp14:editId="7FEB2ED3">
+            <wp:extent cx="3600450" cy="4572000"/>
+            <wp:effectExtent l="0" t="0" r="0" b="0"/>
+            <wp:docPr id="596750829" name="Imagen 2"/>
+            <wp:cNvGraphicFramePr>
+              <a:graphicFrameLocks xmlns:a="http://schemas.openxmlformats.org/drawingml/2006/main" noChangeAspect="1"/>
+            </wp:cNvGraphicFramePr>
+            <a:graphic xmlns:a="http://schemas.openxmlformats.org/drawingml/2006/main">
+              <a:graphicData uri="http://schemas.openxmlformats.org/drawingml/2006/picture">
+                <pic:pic xmlns:pic="http://schemas.openxmlformats.org/drawingml/2006/picture">
+                  <pic:nvPicPr>
+                    <pic:cNvPr id="0" name="Picture 6"/>
+                    <pic:cNvPicPr>
+                      <a:picLocks noChangeAspect="1" noChangeArrowheads="1"/>
+                    </pic:cNvPicPr>
+                  </pic:nvPicPr>
+                  <pic:blipFill>
+                    <a:blip r:embed="rId7">
+                      <a:extLst>
+                        <a:ext uri="{28A0092B-C50C-407E-A947-70E740481C1C}">
+                          <a14:useLocalDpi xmlns:a14="http://schemas.microsoft.com/office/drawing/2010/main" val="0"/>
+                        </a:ext>
+                      </a:extLst>
+                    </a:blip>
+                    <a:srcRect/>
+                    <a:stretch>
+                      <a:fillRect/>
+                    </a:stretch>
+                  </pic:blipFill>
+                  <pic:spPr bwMode="auto">
+                    <a:xfrm>
+                      <a:off x="0" y="0"/>
+                      <a:ext cx="3600450" cy="4572000"/>
+                    </a:xfrm>
+                    <a:prstGeom prst="rect">
+                      <a:avLst/>
+                    </a:prstGeom>
+                    <a:noFill/>
+                    <a:ln>
+                      <a:noFill/>
+                    </a:ln>
+                  </pic:spPr>
+                </pic:pic>
+              </a:graphicData>
+            </a:graphic>
+          </wp:inline>
+        </w:drawing>
+      </w:r>
+    </w:p>
+    <w:p>
+      <w:pPr>
+        <w:rPr>
+          <w:lang w:val="es-AR"/>
+        </w:rPr>
+      </w:pPr>
+    </w:p>
+    <w:p>
+      <w:pPr>
+        <w:rPr>
+          <w:lang w:val="es-AR"/>
+        </w:rPr>
+      </w:pPr>
+    </w:p>
+    <w:p>
+      <w:pPr>
+        <w:spacing w:line="240" w:lineRule="auto"/>
+        <w:rPr>
+          <w:rFonts w:eastAsia="Times New Roman"/>
+          <w:color w:val="000000"/>
+          <w:sz w:val="20"/>
+          <w:szCs w:val="20"/>
+          <w:lang w:val="es-AR"/>
+        </w:rPr>
+      </w:pPr>
+    </w:p>
+    <w:p>
+      <w:pPr>
+        <w:spacing w:line="240" w:lineRule="auto"/>
+        <w:rPr>
+          <w:rFonts w:eastAsia="Times New Roman"/>
+          <w:color w:val="000000"/>
+          <w:sz w:val="20"/>
+          <w:szCs w:val="20"/>
+          <w:lang w:val="es-AR"/>
+        </w:rPr>
+      </w:pPr>
+    </w:p>
+    <w:p>
+      <w:pPr>
+        <w:spacing w:line="240" w:lineRule="auto"/>
+        <w:rPr>
+          <w:rFonts w:eastAsia="Times New Roman"/>
+          <w:color w:val="000000"/>
+          <w:sz w:val="20"/>
+          <w:szCs w:val="20"/>
+          <w:lang w:val="es-AR"/>
+        </w:rPr>
+      </w:pPr>
+    </w:p>
+    <w:p>
+      <w:pPr>
+        <w:spacing w:line="240" w:lineRule="auto"/>
+        <w:rPr>
+          <w:rFonts w:eastAsia="Times New Roman"/>
+          <w:color w:val="000000"/>
+          <w:sz w:val="20"/>
+          <w:szCs w:val="20"/>
+          <w:lang w:val="es-AR"/>
+        </w:rPr>
+      </w:pPr>
+    </w:p>
+    <w:p>
+      <w:pPr>
+        <w:spacing w:line="240" w:lineRule="auto"/>
+        <w:rPr>
+          <w:rFonts w:eastAsia="Times New Roman"/>
+          <w:color w:val="000000"/>
+          <w:sz w:val="20"/>
+          <w:szCs w:val="20"/>
+          <w:lang w:val="es-AR"/>
+        </w:rPr>
+      </w:pPr>
+    </w:p>
+    <w:p>
+      <w:pPr>
+        <w:spacing w:line="240" w:lineRule="auto"/>
+        <w:rPr>
+          <w:rFonts w:eastAsia="Times New Roman"/>
+          <w:color w:val="000000"/>
+          <w:sz w:val="20"/>
+          <w:szCs w:val="20"/>
+          <w:lang w:val="es-AR"/>
+        </w:rPr>
+      </w:pPr>
+    </w:p>
+    <w:p>
+      <w:pPr>
+        <w:spacing w:line="240" w:lineRule="auto"/>
+        <w:rPr>
+          <w:rFonts w:eastAsia="Times New Roman"/>
+          <w:color w:val="000000"/>
+          <w:sz w:val="20"/>
+          <w:szCs w:val="20"/>
+          <w:lang w:val="es-AR"/>
+        </w:rPr>
+      </w:pPr>
+    </w:p>
+    <w:p>
+      <w:pPr>
+        <w:spacing w:line="240" w:lineRule="auto"/>
+        <w:rPr>
+          <w:rFonts w:eastAsia="Times New Roman"/>
+          <w:color w:val="000000"/>
+          <w:sz w:val="20"/>
+          <w:szCs w:val="20"/>
+          <w:lang w:val="es-AR"/>
+        </w:rPr>
+      </w:pPr>
+    </w:p>
+    <w:p>
+      <w:pPr>
+        <w:spacing w:line="240" w:lineRule="auto"/>
+        <w:rPr>
+          <w:rFonts w:eastAsia="Times New Roman"/>
+          <w:color w:val="000000"/>
+          <w:sz w:val="20"/>
+          <w:szCs w:val="20"/>
+          <w:lang w:val="es-AR"/>
+        </w:rPr>
+      </w:pPr>
+    </w:p>
+    <w:p>
+      <w:pPr>
+        <w:spacing w:line="240" w:lineRule="auto"/>
+        <w:rPr>
+          <w:rFonts w:eastAsia="Times New Roman"/>
+          <w:color w:val="000000"/>
+          <w:sz w:val="20"/>
+          <w:szCs w:val="20"/>
+          <w:lang w:val="es-AR"/>
+        </w:rPr>
+      </w:pPr>
+    </w:p>
+    <w:p>
+      <w:pPr>
+        <w:spacing w:line="240" w:lineRule="auto"/>
+        <w:rPr>
+          <w:rFonts w:eastAsia="Times New Roman"/>
+          <w:color w:val="000000"/>
+          <w:sz w:val="20"/>
+          <w:szCs w:val="20"/>
+          <w:lang w:val="es-AR"/>
+        </w:rPr>
+      </w:pPr>
+    </w:p>
+    <w:p>
+      <w:pPr>
+        <w:spacing w:line="240" w:lineRule="auto"/>
+        <w:rPr>
+          <w:rFonts w:eastAsia="Times New Roman"/>
+          <w:color w:val="000000"/>
+          <w:sz w:val="20"/>
+          <w:szCs w:val="20"/>
+          <w:lang w:val="es-AR"/>
+        </w:rPr>
+      </w:pPr>
+    </w:p>
+    <w:p>
+      <w:pPr>
+        <w:spacing w:line="240" w:lineRule="auto"/>
+        <w:rPr>
+          <w:rFonts w:eastAsia="Times New Roman"/>
+          <w:color w:val="000000"/>
+          <w:sz w:val="20"/>
+          <w:szCs w:val="20"/>
+          <w:lang w:val="es-AR"/>
+        </w:rPr>
+      </w:pPr>
+    </w:p>
+    <w:p>
+      <w:pPr>
+        <w:spacing w:line="240" w:lineRule="auto"/>
+        <w:rPr>
+          <w:rFonts w:eastAsia="Times New Roman"/>
+          <w:color w:val="000000"/>
+          <w:sz w:val="20"/>
+          <w:szCs w:val="20"/>
+          <w:lang w:val="es-AR"/>
+        </w:rPr>
+      </w:pPr>
+    </w:p>
+    <w:p>
+      <w:pPr>
+        <w:spacing w:line="240" w:lineRule="auto"/>
+        <w:rPr>
+          <w:rFonts w:eastAsia="Times New Roman"/>
+          <w:color w:val="000000"/>
+          <w:sz w:val="20"/>
+          <w:szCs w:val="20"/>
+          <w:lang w:val="es-AR"/>
+        </w:rPr>
+      </w:pPr>
+    </w:p>
+    <w:p>
+      <w:pPr>
+        <w:spacing w:line="240" w:lineRule="auto"/>
+        <w:rPr>
+          <w:rFonts w:eastAsia="Times New Roman"/>
+          <w:color w:val="000000"/>
+          <w:sz w:val="20"/>
+          <w:szCs w:val="20"/>
+          <w:lang w:val="es-AR"/>
+        </w:rPr>
+      </w:pPr>
+    </w:p>
+    <w:p>
+      <w:pPr>
+        <w:spacing w:line="240" w:lineRule="auto"/>
+        <w:rPr>
+          <w:rFonts w:eastAsia="Times New Roman"/>
+          <w:color w:val="000000"/>
+          <w:sz w:val="20"/>
+          <w:szCs w:val="20"/>
+          <w:lang w:val="es-AR"/>
+        </w:rPr>
+      </w:pPr>
+    </w:p>
+    <w:p>
+      <w:pPr>
+        <w:spacing w:line="240" w:lineRule="auto"/>
+        <w:rPr>
+          <w:rFonts w:eastAsia="Times New Roman"/>
+          <w:color w:val="000000"/>
+          <w:sz w:val="20"/>
+          <w:szCs w:val="20"/>
+          <w:lang w:val="es-AR"/>
+        </w:rPr>
+      </w:pPr>
+    </w:p>
+    <w:p>
+      <w:pPr>
+        <w:spacing w:line="240" w:lineRule="auto"/>
+        <w:jc w:val="center"/>
+        <w:rPr>
+          <w:rFonts w:eastAsia="Times New Roman"/>
+          <w:b/>
+          <w:bCs/>
+          <w:color w:val="000000"/>
+          <w:sz w:val="28"/>
+          <w:szCs w:val="28"/>
+          <w:lang w:val="es-AR"/>
+        </w:rPr>
+      </w:pPr>
+      <w:r>
+        <w:rPr>
+          <w:rFonts w:eastAsia="Times New Roman"/>
+          <w:b/>
+          <w:bCs/>
+          <w:color w:val="000000"/>
+          <w:sz w:val="28"/>
+          <w:szCs w:val="28"/>
+          <w:lang w:val="es-AR"/>
+        </w:rPr>
+        <w:t>DESVIO DE CAMIONES BARRIO EBA FINDE</w:t>
+      </w:r>
+    </w:p>
+    <w:p>
+      <w:pPr>
+        <w:spacing w:line="240" w:lineRule="auto"/>
+        <w:rPr>
+          <w:rFonts w:eastAsia="Times New Roman"/>
+          <w:b/>
+          <w:bCs/>
+          <w:color w:val="000000"/>
+          <w:sz w:val="28"/>
+          <w:szCs w:val="28"/>
+          <w:lang w:val="es-AR"/>
+        </w:rPr>
+      </w:pPr>
+    </w:p>
+    <w:p>
+      <w:pPr>
+        <w:rPr>
+          <w:lang w:val="es-AR"/>
+        </w:rPr>
+      </w:pPr>
+      <w:r>
+        <w:rPr>
+          <w:noProof/>
+          <w:lang w:val="es-AR"/>
+        </w:rPr>
+        <w:drawing>
+          <wp:inline distT="0" distB="0" distL="0" distR="0" wp14:anchorId="631ED493" wp14:editId="4739DB73">
+            <wp:extent cx="5733415" cy="2545080"/>
+            <wp:effectExtent l="0" t="0" r="635" b="7620"/>
+            <wp:docPr id="22383845" name="Imagen 4"/>
+            <wp:cNvGraphicFramePr>
+              <a:graphicFrameLocks xmlns:a="http://schemas.openxmlformats.org/drawingml/2006/main" noChangeAspect="1"/>
+            </wp:cNvGraphicFramePr>
+            <a:graphic xmlns:a="http://schemas.openxmlformats.org/drawingml/2006/main">
+              <a:graphicData uri="http://schemas.openxmlformats.org/drawingml/2006/picture">
+                <pic:pic xmlns:pic="http://schemas.openxmlformats.org/drawingml/2006/picture">
+                  <pic:nvPicPr>
+                    <pic:cNvPr id="0" name="Picture 13"/>
+                    <pic:cNvPicPr>
+                      <a:picLocks noChangeAspect="1" noChangeArrowheads="1"/>
+                    </pic:cNvPicPr>
+                  </pic:nvPicPr>
+                  <pic:blipFill>
+                    <a:blip r:embed="rId8">
+                      <a:extLst>
+                        <a:ext uri="{28A0092B-C50C-407E-A947-70E740481C1C}">
+                          <a14:useLocalDpi xmlns:a14="http://schemas.microsoft.com/office/drawing/2010/main" val="0"/>
+                        </a:ext>
+                      </a:extLst>
+                    </a:blip>
+                    <a:srcRect/>
+                    <a:stretch>
+                      <a:fillRect/>
+                    </a:stretch>
+                  </pic:blipFill>
+                  <pic:spPr bwMode="auto">
+                    <a:xfrm>
+                      <a:off x="0" y="0"/>
+                      <a:ext cx="5733415" cy="2545080"/>
+                    </a:xfrm>
+                    <a:prstGeom prst="rect">
+                      <a:avLst/>
+                    </a:prstGeom>
+                    <a:noFill/>
+                    <a:ln>
+                      <a:noFill/>
+                    </a:ln>
+                  </pic:spPr>
+                </pic:pic>
+              </a:graphicData>
+            </a:graphic>
+          </wp:inline>
+        </w:drawing>
+      </w:r>
+    </w:p>
+    <w:p>
+      <w:pPr>
+        <w:rPr>
+          <w:lang w:val="es-AR"/>
+        </w:rPr>
+      </w:pPr>
+    </w:p>
+    <w:p>
+      <w:pPr>
+        <w:rPr>
+          <w:lang w:val="es-AR"/>
+        </w:rPr>
+      </w:pPr>
+    </w:p>
+    <w:p>
+      <w:pPr>
+        <w:rPr>
+          <w:lang w:val="es-AR"/>
+        </w:rPr>
+      </w:pPr>
+    </w:p>
+    <w:p>
+      <w:pPr>
+        <w:spacing w:line="240" w:lineRule="auto"/>
+        <w:jc w:val="center"/>
+        <w:rPr>
+          <w:rFonts w:eastAsia="Times New Roman"/>
+          <w:b/>
+          <w:bCs/>
+          <w:color w:val="000000"/>
+          <w:sz w:val="28"/>
+          <w:szCs w:val="28"/>
+          <w:lang w:val="es-AR"/>
+        </w:rPr>
+      </w:pPr>
+      <w:r>
+        <w:rPr>
+          <w:rFonts w:eastAsia="Times New Roman"/>
+          <w:b/>
+          <w:bCs/>
+          <w:color w:val="000000"/>
+          <w:sz w:val="28"/>
+          <w:szCs w:val="28"/>
+          <w:lang w:val="es-AR"/>
+        </w:rPr>
+        <w:t>CAMBIO DE SENTIDO ALSINA FINDE</w:t>
+      </w:r>
+    </w:p>
+    <w:p>
+      <w:pPr>
+        <w:spacing w:line="240" w:lineRule="auto"/>
+        <w:rPr>
+          <w:rFonts w:eastAsia="Times New Roman"/>
+          <w:b/>
+          <w:bCs/>
+          <w:color w:val="000000"/>
+          <w:sz w:val="28"/>
+          <w:szCs w:val="28"/>
+          <w:lang w:val="es-AR"/>
+        </w:rPr>
+      </w:pPr>
+    </w:p>
+    <w:p>
+      <w:pPr>
+        <w:rPr>
+          <w:lang w:val="es-AR"/>
+        </w:rPr>
+      </w:pPr>
+      <w:r>
+        <w:rPr>
+          <w:noProof/>
+          <w:lang w:val="es-AR"/>
+        </w:rPr>
+        <w:drawing>
+          <wp:inline distT="0" distB="0" distL="0" distR="0" wp14:anchorId="7AC086D3" wp14:editId="44691971">
+            <wp:extent cx="5733415" cy="3150235"/>
+            <wp:effectExtent l="0" t="0" r="635" b="0"/>
+            <wp:docPr id="480456423" name="Imagen 6"/>
+            <wp:cNvGraphicFramePr>
+              <a:graphicFrameLocks xmlns:a="http://schemas.openxmlformats.org/drawingml/2006/main" noChangeAspect="1"/>
+            </wp:cNvGraphicFramePr>
+            <a:graphic xmlns:a="http://schemas.openxmlformats.org/drawingml/2006/main">
+              <a:graphicData uri="http://schemas.openxmlformats.org/drawingml/2006/picture">
+                <pic:pic xmlns:pic="http://schemas.openxmlformats.org/drawingml/2006/picture">
+                  <pic:nvPicPr>
+                    <pic:cNvPr id="0" name="Picture 20"/>
+                    <pic:cNvPicPr>
+                      <a:picLocks noChangeAspect="1" noChangeArrowheads="1"/>
+                    </pic:cNvPicPr>
+                  </pic:nvPicPr>
+                  <pic:blipFill>
+                    <a:blip r:embed="rId9">
+                      <a:extLst>
+                        <a:ext uri="{28A0092B-C50C-407E-A947-70E740481C1C}">
+                          <a14:useLocalDpi xmlns:a14="http://schemas.microsoft.com/office/drawing/2010/main" val="0"/>
+                        </a:ext>
+                      </a:extLst>
+                    </a:blip>
+                    <a:srcRect/>
+                    <a:stretch>
+                      <a:fillRect/>
+                    </a:stretch>
+                  </pic:blipFill>
+                  <pic:spPr bwMode="auto">
+                    <a:xfrm>
+                      <a:off x="0" y="0"/>
+                      <a:ext cx="5733415" cy="3150235"/>
+                    </a:xfrm>
+                    <a:prstGeom prst="rect">
+                      <a:avLst/>
+                    </a:prstGeom>
+                    <a:noFill/>
+                    <a:ln>
+                      <a:noFill/>
+                    </a:ln>
+                  </pic:spPr>
+                </pic:pic>
+              </a:graphicData>
+            </a:graphic>
+          </wp:inline>
+        </w:drawing>
+      </w:r>
+    </w:p>
+    <w:p>
+      <w:pPr>
+        <w:rPr>
+          <w:lang w:val="es-AR"/>
+        </w:rPr>
+      </w:pPr>
+    </w:p>
+    <w:p>
+      <w:pPr>
+        <w:rPr>
+          <w:lang w:val="es-AR"/>
+        </w:rPr>
+      </w:pPr>
+    </w:p>
+    <w:p>
+      <w:pPr>
+        <w:rPr>
+          <w:lang w:val="es-AR"/>
+        </w:rPr>
+      </w:pPr>
+    </w:p>
+    <w:p>
+      <w:pPr>
+        <w:rPr>
+          <w:lang w:val="es-AR"/>
+        </w:rPr>
+      </w:pPr>
+    </w:p>
+    <w:p>
+      <w:pPr>
+        <w:rPr>
+          <w:lang w:val="es-AR"/>
+        </w:rPr>
+      </w:pPr>
+    </w:p>
+    <w:p>
+      <w:pPr>
+        <w:rPr>
+          <w:lang w:val="es-AR"/>
+        </w:rPr>
+      </w:pPr>
+    </w:p>
     <w:p/>
     <w:sectPr>
-      <w:headerReference w:type="default" r:id="rId11"/>
-      <w:footerReference w:type="default" r:id="rId12"/>
+      <w:headerReference w:type="default" r:id="rId10"/>
+      <w:footerReference w:type="default" r:id="rId11"/>
       <w:pgSz w:w="11909" w:h="16834"/>
       <w:pgMar w:top="1440" w:right="1440" w:bottom="1440" w:left="1440" w:header="720" w:footer="720" w:gutter="0"/>
       <w:pgNumType w:start="1"/>
@@ -38,167 +638,8 @@
 </w:document>
 </file>
 
-<file path=word/comments.xml><?xml version="1.0" encoding="utf-8"?>
-<w:comments xmlns:wpc="http://schemas.microsoft.com/office/word/2010/wordprocessingCanvas" xmlns:cx="http://schemas.microsoft.com/office/drawing/2014/chartex" xmlns:cx1="http://schemas.microsoft.com/office/drawing/2015/9/8/chartex" xmlns:cx2="http://schemas.microsoft.com/office/drawing/2015/10/21/chartex" xmlns:cx3="http://schemas.microsoft.com/office/drawing/2016/5/9/chartex" xmlns:cx4="http://schemas.microsoft.com/office/drawing/2016/5/10/chartex" xmlns:cx5="http://schemas.microsoft.com/office/drawing/2016/5/11/chartex" xmlns:cx6="http://schemas.microsoft.com/office/drawing/2016/5/12/chartex" xmlns:cx7="http://schemas.microsoft.com/office/drawing/2016/5/13/chartex" xmlns:cx8="http://schemas.microsoft.com/office/drawing/2016/5/14/chartex" xmlns:mc="http://schemas.openxmlformats.org/markup-compatibility/2006" xmlns:aink="http://schemas.microsoft.com/office/drawing/2016/ink" xmlns:am3d="http://schemas.microsoft.com/office/drawing/2017/model3d" xmlns:o="urn:schemas-microsoft-com:office:office" xmlns:oel="http://schemas.microsoft.com/office/2019/extlst" xmlns:r="http://schemas.openxmlformats.org/officeDocument/2006/relationships" xmlns:m="http://schemas.openxmlformats.org/officeDocument/2006/math" xmlns:v="urn:schemas-microsoft-com:vml" xmlns:wp14="http://schemas.microsoft.com/office/word/2010/wordprocessingDrawing" xmlns:wp="http://schemas.openxmlformats.org/drawingml/2006/wordprocessingDrawing" xmlns:w10="urn:schemas-microsoft-com:office:word" xmlns:w="http://schemas.openxmlformats.org/wordprocessingml/2006/main" xmlns:w14="http://schemas.microsoft.com/office/word/2010/wordml" xmlns:w15="http://schemas.microsoft.com/office/word/2012/wordml" xmlns:w16cex="http://schemas.microsoft.com/office/word/2018/wordml/cex" xmlns:w16cid="http://schemas.microsoft.com/office/word/2016/wordml/cid" xmlns:w16="http://schemas.microsoft.com/office/word/2018/wordml" xmlns:w16du="http://schemas.microsoft.com/office/word/2023/wordml/word16du" xmlns:w16sdtdh="http://schemas.microsoft.com/office/word/2020/wordml/sdtdatahash" xmlns:w16se="http://schemas.microsoft.com/office/word/2015/wordml/symex" xmlns:wpg="http://schemas.microsoft.com/office/word/2010/wordprocessingGroup" xmlns:wpi="http://schemas.microsoft.com/office/word/2010/wordprocessingInk" xmlns:wne="http://schemas.microsoft.com/office/word/2006/wordml" xmlns:wps="http://schemas.microsoft.com/office/word/2010/wordprocessingShape" mc:Ignorable="w14 w15 w16se w16cid w16 w16cex w16sdtdh w16du wp14">
-  <w:comment w:id="0" w:author="Agustin Ricciardi" w:date="2026-01-08T20:54:00Z" w:initials="">
-    <w:p>
-      <w:pPr>
-        <w:widowControl w:val="0"/>
-        <w:pBdr>
-          <w:top w:val="nil"/>
-          <w:left w:val="nil"/>
-          <w:bottom w:val="nil"/>
-          <w:right w:val="nil"/>
-          <w:between w:val="nil"/>
-        </w:pBdr>
-        <w:spacing w:line="240" w:lineRule="auto"/>
-        <w:rPr>
-          <w:color w:val="000000"/>
-        </w:rPr>
-      </w:pPr>
-      <w:r>
-        <w:rPr>
-          <w:color w:val="000000"/>
-        </w:rPr>
-        <w:t>Sugerencias en base a carga de ODS 01-2026:</w:t>
-      </w:r>
-    </w:p>
-    <w:p>
-      <w:pPr>
-        <w:widowControl w:val="0"/>
-        <w:pBdr>
-          <w:top w:val="nil"/>
-          <w:left w:val="nil"/>
-          <w:bottom w:val="nil"/>
-          <w:right w:val="nil"/>
-          <w:between w:val="nil"/>
-        </w:pBdr>
-        <w:spacing w:line="240" w:lineRule="auto"/>
-        <w:rPr>
-          <w:color w:val="000000"/>
-        </w:rPr>
-      </w:pPr>
-    </w:p>
-    <w:p>
-      <w:pPr>
-        <w:widowControl w:val="0"/>
-        <w:pBdr>
-          <w:top w:val="nil"/>
-          <w:left w:val="nil"/>
-          <w:bottom w:val="nil"/>
-          <w:right w:val="nil"/>
-          <w:between w:val="nil"/>
-        </w:pBdr>
-        <w:spacing w:line="240" w:lineRule="auto"/>
-        <w:rPr>
-          <w:color w:val="000000"/>
-        </w:rPr>
-      </w:pPr>
-      <w:r>
-        <w:rPr>
-          <w:color w:val="000000"/>
-        </w:rPr>
-        <w:t xml:space="preserve">- Cambiar </w:t>
-      </w:r>
-      <w:proofErr w:type="spellStart"/>
-      <w:r>
-        <w:rPr>
-          <w:color w:val="000000"/>
-        </w:rPr>
-        <w:t>numeracion</w:t>
-      </w:r>
-      <w:proofErr w:type="spellEnd"/>
-      <w:r>
-        <w:rPr>
-          <w:color w:val="000000"/>
-        </w:rPr>
-        <w:t xml:space="preserve"> del titulo</w:t>
-      </w:r>
-    </w:p>
-    <w:p>
-      <w:pPr>
-        <w:widowControl w:val="0"/>
-        <w:pBdr>
-          <w:top w:val="nil"/>
-          <w:left w:val="nil"/>
-          <w:bottom w:val="nil"/>
-          <w:right w:val="nil"/>
-          <w:between w:val="nil"/>
-        </w:pBdr>
-        <w:spacing w:line="240" w:lineRule="auto"/>
-        <w:rPr>
-          <w:color w:val="000000"/>
-        </w:rPr>
-      </w:pPr>
-      <w:r>
-        <w:rPr>
-          <w:color w:val="000000"/>
-        </w:rPr>
-        <w:t xml:space="preserve">- Modificar fecha de </w:t>
-      </w:r>
-      <w:proofErr w:type="spellStart"/>
-      <w:r>
-        <w:rPr>
-          <w:color w:val="000000"/>
-        </w:rPr>
-        <w:t>aplicacion</w:t>
-      </w:r>
-      <w:proofErr w:type="spellEnd"/>
-    </w:p>
-    <w:p>
-      <w:pPr>
-        <w:widowControl w:val="0"/>
-        <w:pBdr>
-          <w:top w:val="nil"/>
-          <w:left w:val="nil"/>
-          <w:bottom w:val="nil"/>
-          <w:right w:val="nil"/>
-          <w:between w:val="nil"/>
-        </w:pBdr>
-        <w:spacing w:line="240" w:lineRule="auto"/>
-        <w:rPr>
-          <w:color w:val="000000"/>
-        </w:rPr>
-      </w:pPr>
-      <w:r>
-        <w:rPr>
-          <w:color w:val="000000"/>
-        </w:rPr>
-        <w:t xml:space="preserve">- Enviar siempre en formato PDF con el nombre ODS_Comunas_002_2026 (o </w:t>
-      </w:r>
-      <w:proofErr w:type="spellStart"/>
-      <w:r>
-        <w:rPr>
-          <w:color w:val="000000"/>
-        </w:rPr>
-        <w:t>numero</w:t>
-      </w:r>
-      <w:proofErr w:type="spellEnd"/>
-      <w:r>
-        <w:rPr>
-          <w:color w:val="000000"/>
-        </w:rPr>
-        <w:t xml:space="preserve"> que corresponda)</w:t>
-      </w:r>
-    </w:p>
-  </w:comment>
-</w:comments>
-</file>
-
-<file path=word/commentsExtended.xml><?xml version="1.0" encoding="utf-8"?>
-<w15:commentsEx xmlns:wpc="http://schemas.microsoft.com/office/word/2010/wordprocessingCanvas" xmlns:cx="http://schemas.microsoft.com/office/drawing/2014/chartex" xmlns:cx1="http://schemas.microsoft.com/office/drawing/2015/9/8/chartex" xmlns:cx2="http://schemas.microsoft.com/office/drawing/2015/10/21/chartex" xmlns:cx3="http://schemas.microsoft.com/office/drawing/2016/5/9/chartex" xmlns:cx4="http://schemas.microsoft.com/office/drawing/2016/5/10/chartex" xmlns:cx5="http://schemas.microsoft.com/office/drawing/2016/5/11/chartex" xmlns:cx6="http://schemas.microsoft.com/office/drawing/2016/5/12/chartex" xmlns:cx7="http://schemas.microsoft.com/office/drawing/2016/5/13/chartex" xmlns:cx8="http://schemas.microsoft.com/office/drawing/2016/5/14/chartex" xmlns:mc="http://schemas.openxmlformats.org/markup-compatibility/2006" xmlns:aink="http://schemas.microsoft.com/office/drawing/2016/ink" xmlns:am3d="http://schemas.microsoft.com/office/drawing/2017/model3d" xmlns:o="urn:schemas-microsoft-com:office:office" xmlns:oel="http://schemas.microsoft.com/office/2019/extlst" xmlns:r="http://schemas.openxmlformats.org/officeDocument/2006/relationships" xmlns:m="http://schemas.openxmlformats.org/officeDocument/2006/math" xmlns:v="urn:schemas-microsoft-com:vml" xmlns:wp14="http://schemas.microsoft.com/office/word/2010/wordprocessingDrawing" xmlns:wp="http://schemas.openxmlformats.org/drawingml/2006/wordprocessingDrawing" xmlns:w10="urn:schemas-microsoft-com:office:word" xmlns:w="http://schemas.openxmlformats.org/wordprocessingml/2006/main" xmlns:w14="http://schemas.microsoft.com/office/word/2010/wordml" xmlns:w15="http://schemas.microsoft.com/office/word/2012/wordml" xmlns:w16cex="http://schemas.microsoft.com/office/word/2018/wordml/cex" xmlns:w16cid="http://schemas.microsoft.com/office/word/2016/wordml/cid" xmlns:w16="http://schemas.microsoft.com/office/word/2018/wordml" xmlns:w16du="http://schemas.microsoft.com/office/word/2023/wordml/word16du" xmlns:w16sdtdh="http://schemas.microsoft.com/office/word/2020/wordml/sdtdatahash" xmlns:w16se="http://schemas.microsoft.com/office/word/2015/wordml/symex" xmlns:wpg="http://schemas.microsoft.com/office/word/2010/wordprocessingGroup" xmlns:wpi="http://schemas.microsoft.com/office/word/2010/wordprocessingInk" xmlns:wne="http://schemas.microsoft.com/office/word/2006/wordml" xmlns:wps="http://schemas.microsoft.com/office/word/2010/wordprocessingShape" mc:Ignorable="w14 w15 w16se w16cid w16 w16cex w16sdtdh w16du wp14">
-  <w15:commentEx w15:paraId="22E07713" w15:done="0"/>
-</w15:commentsEx>
-</file>
-
-<file path=word/commentsIds.xml><?xml version="1.0" encoding="utf-8"?>
-<w16cid:commentsIds xmlns:wpc="http://schemas.microsoft.com/office/word/2010/wordprocessingCanvas" xmlns:cx="http://schemas.microsoft.com/office/drawing/2014/chartex" xmlns:cx1="http://schemas.microsoft.com/office/drawing/2015/9/8/chartex" xmlns:cx2="http://schemas.microsoft.com/office/drawing/2015/10/21/chartex" xmlns:cx3="http://schemas.microsoft.com/office/drawing/2016/5/9/chartex" xmlns:cx4="http://schemas.microsoft.com/office/drawing/2016/5/10/chartex" xmlns:cx5="http://schemas.microsoft.com/office/drawing/2016/5/11/chartex" xmlns:cx6="http://schemas.microsoft.com/office/drawing/2016/5/12/chartex" xmlns:cx7="http://schemas.microsoft.com/office/drawing/2016/5/13/chartex" xmlns:cx8="http://schemas.microsoft.com/office/drawing/2016/5/14/chartex" xmlns:mc="http://schemas.openxmlformats.org/markup-compatibility/2006" xmlns:aink="http://schemas.microsoft.com/office/drawing/2016/ink" xmlns:am3d="http://schemas.microsoft.com/office/drawing/2017/model3d" xmlns:o="urn:schemas-microsoft-com:office:office" xmlns:oel="http://schemas.microsoft.com/office/2019/extlst" xmlns:r="http://schemas.openxmlformats.org/officeDocument/2006/relationships" xmlns:m="http://schemas.openxmlformats.org/officeDocument/2006/math" xmlns:v="urn:schemas-microsoft-com:vml" xmlns:wp14="http://schemas.microsoft.com/office/word/2010/wordprocessingDrawing" xmlns:wp="http://schemas.openxmlformats.org/drawingml/2006/wordprocessingDrawing" xmlns:w10="urn:schemas-microsoft-com:office:word" xmlns:w="http://schemas.openxmlformats.org/wordprocessingml/2006/main" xmlns:w14="http://schemas.microsoft.com/office/word/2010/wordml" xmlns:w15="http://schemas.microsoft.com/office/word/2012/wordml" xmlns:w16cex="http://schemas.microsoft.com/office/word/2018/wordml/cex" xmlns:w16cid="http://schemas.microsoft.com/office/word/2016/wordml/cid" xmlns:w16="http://schemas.microsoft.com/office/word/2018/wordml" xmlns:w16du="http://schemas.microsoft.com/office/word/2023/wordml/word16du" xmlns:w16sdtdh="http://schemas.microsoft.com/office/word/2020/wordml/sdtdatahash" xmlns:w16se="http://schemas.microsoft.com/office/word/2015/wordml/symex" xmlns:wpg="http://schemas.microsoft.com/office/word/2010/wordprocessingGroup" xmlns:wpi="http://schemas.microsoft.com/office/word/2010/wordprocessingInk" xmlns:wne="http://schemas.microsoft.com/office/word/2006/wordml" xmlns:wps="http://schemas.microsoft.com/office/word/2010/wordprocessingShape" mc:Ignorable="w14 w15 w16se w16cid w16 w16cex w16sdtdh w16du wp14">
-  <w16cid:commentId w16cid:paraId="22E07713" w16cid:durableId="5DBD38CD"/>
-</w16cid:commentsIds>
-</file>
-
 <file path=word/endnotes.xml><?xml version="1.0" encoding="utf-8"?>
-<w:endnotes xmlns:wpc="http://schemas.microsoft.com/office/word/2010/wordprocessingCanvas" xmlns:cx="http://schemas.microsoft.com/office/drawing/2014/chartex" xmlns:cx1="http://schemas.microsoft.com/office/drawing/2015/9/8/chartex" xmlns:cx2="http://schemas.microsoft.com/office/drawing/2015/10/21/chartex" xmlns:cx3="http://schemas.microsoft.com/office/drawing/2016/5/9/chartex" xmlns:cx4="http://schemas.microsoft.com/office/drawing/2016/5/10/chartex" xmlns:cx5="http://schemas.microsoft.com/office/drawing/2016/5/11/chartex" xmlns:cx6="http://schemas.microsoft.com/office/drawing/2016/5/12/chartex" xmlns:cx7="http://schemas.microsoft.com/office/drawing/2016/5/13/chartex" xmlns:cx8="http://schemas.microsoft.com/office/drawing/2016/5/14/chartex" xmlns:mc="http://schemas.openxmlformats.org/markup-compatibility/2006" xmlns:aink="http://schemas.microsoft.com/office/drawing/2016/ink" xmlns:am3d="http://schemas.microsoft.com/office/drawing/2017/model3d" xmlns:o="urn:schemas-microsoft-com:office:office" xmlns:oel="http://schemas.microsoft.com/office/2019/extlst" xmlns:r="http://schemas.openxmlformats.org/officeDocument/2006/relationships" xmlns:m="http://schemas.openxmlformats.org/officeDocument/2006/math" xmlns:v="urn:schemas-microsoft-com:vml" xmlns:wp14="http://schemas.microsoft.com/office/word/2010/wordprocessingDrawing" xmlns:wp="http://schemas.openxmlformats.org/drawingml/2006/wordprocessingDrawing" xmlns:w10="urn:schemas-microsoft-com:office:word" xmlns:w="http://schemas.openxmlformats.org/wordprocessingml/2006/main" xmlns:w14="http://schemas.microsoft.com/office/word/2010/wordml" xmlns:w15="http://schemas.microsoft.com/office/word/2012/wordml" xmlns:w16cex="http://schemas.microsoft.com/office/word/2018/wordml/cex" xmlns:w16cid="http://schemas.microsoft.com/office/word/2016/wordml/cid" xmlns:w16="http://schemas.microsoft.com/office/word/2018/wordml" xmlns:w16du="http://schemas.microsoft.com/office/word/2023/wordml/word16du" xmlns:w16sdtdh="http://schemas.microsoft.com/office/word/2020/wordml/sdtdatahash" xmlns:w16se="http://schemas.microsoft.com/office/word/2015/wordml/symex" xmlns:wpg="http://schemas.microsoft.com/office/word/2010/wordprocessingGroup" xmlns:wpi="http://schemas.microsoft.com/office/word/2010/wordprocessingInk" xmlns:wne="http://schemas.microsoft.com/office/word/2006/wordml" xmlns:wps="http://schemas.microsoft.com/office/word/2010/wordprocessingShape" mc:Ignorable="w14 w15 w16se w16cid w16 w16cex w16sdtdh w16du wp14">
+<w:endnotes xmlns:wpc="http://schemas.microsoft.com/office/word/2010/wordprocessingCanvas" xmlns:cx="http://schemas.microsoft.com/office/drawing/2014/chartex" xmlns:cx1="http://schemas.microsoft.com/office/drawing/2015/9/8/chartex" xmlns:cx2="http://schemas.microsoft.com/office/drawing/2015/10/21/chartex" xmlns:cx3="http://schemas.microsoft.com/office/drawing/2016/5/9/chartex" xmlns:cx4="http://schemas.microsoft.com/office/drawing/2016/5/10/chartex" xmlns:cx5="http://schemas.microsoft.com/office/drawing/2016/5/11/chartex" xmlns:cx6="http://schemas.microsoft.com/office/drawing/2016/5/12/chartex" xmlns:cx7="http://schemas.microsoft.com/office/drawing/2016/5/13/chartex" xmlns:cx8="http://schemas.microsoft.com/office/drawing/2016/5/14/chartex" xmlns:mc="http://schemas.openxmlformats.org/markup-compatibility/2006" xmlns:aink="http://schemas.microsoft.com/office/drawing/2016/ink" xmlns:am3d="http://schemas.microsoft.com/office/drawing/2017/model3d" xmlns:o="urn:schemas-microsoft-com:office:office" xmlns:oel="http://schemas.microsoft.com/office/2019/extlst" xmlns:r="http://schemas.openxmlformats.org/officeDocument/2006/relationships" xmlns:m="http://schemas.openxmlformats.org/officeDocument/2006/math" xmlns:v="urn:schemas-microsoft-com:vml" xmlns:wp14="http://schemas.microsoft.com/office/word/2010/wordprocessingDrawing" xmlns:wp="http://schemas.openxmlformats.org/drawingml/2006/wordprocessingDrawing" xmlns:w10="urn:schemas-microsoft-com:office:word" xmlns:w="http://schemas.openxmlformats.org/wordprocessingml/2006/main" xmlns:w14="http://schemas.microsoft.com/office/word/2010/wordml" xmlns:w15="http://schemas.microsoft.com/office/word/2012/wordml" xmlns:w16cex="http://schemas.microsoft.com/office/word/2018/wordml/cex" xmlns:w16cid="http://schemas.microsoft.com/office/word/2016/wordml/cid" xmlns:w16="http://schemas.microsoft.com/office/word/2018/wordml" xmlns:w16du="http://schemas.microsoft.com/office/word/2023/wordml/word16du" xmlns:w16sdtdh="http://schemas.microsoft.com/office/word/2020/wordml/sdtdatahash" xmlns:w16sdtfl="http://schemas.microsoft.com/office/word/2024/wordml/sdtformatlock" xmlns:w16se="http://schemas.microsoft.com/office/word/2015/wordml/symex" xmlns:wpg="http://schemas.microsoft.com/office/word/2010/wordprocessingGroup" xmlns:wpi="http://schemas.microsoft.com/office/word/2010/wordprocessingInk" xmlns:wne="http://schemas.microsoft.com/office/word/2006/wordml" xmlns:wps="http://schemas.microsoft.com/office/word/2010/wordprocessingShape" mc:Ignorable="w14 w15 w16se w16cid w16 w16cex w16sdtdh w16sdtfl w16du wp14">
   <w:endnote w:type="separator" w:id="-1">
     <w:p>
       <w:pPr>
@@ -223,7 +664,7 @@
 </file>
 
 <file path=word/footer1.xml><?xml version="1.0" encoding="utf-8"?>
-<w:ftr xmlns:wpc="http://schemas.microsoft.com/office/word/2010/wordprocessingCanvas" xmlns:cx="http://schemas.microsoft.com/office/drawing/2014/chartex" xmlns:cx1="http://schemas.microsoft.com/office/drawing/2015/9/8/chartex" xmlns:cx2="http://schemas.microsoft.com/office/drawing/2015/10/21/chartex" xmlns:cx3="http://schemas.microsoft.com/office/drawing/2016/5/9/chartex" xmlns:cx4="http://schemas.microsoft.com/office/drawing/2016/5/10/chartex" xmlns:cx5="http://schemas.microsoft.com/office/drawing/2016/5/11/chartex" xmlns:cx6="http://schemas.microsoft.com/office/drawing/2016/5/12/chartex" xmlns:cx7="http://schemas.microsoft.com/office/drawing/2016/5/13/chartex" xmlns:cx8="http://schemas.microsoft.com/office/drawing/2016/5/14/chartex" xmlns:mc="http://schemas.openxmlformats.org/markup-compatibility/2006" xmlns:aink="http://schemas.microsoft.com/office/drawing/2016/ink" xmlns:am3d="http://schemas.microsoft.com/office/drawing/2017/model3d" xmlns:o="urn:schemas-microsoft-com:office:office" xmlns:oel="http://schemas.microsoft.com/office/2019/extlst" xmlns:r="http://schemas.openxmlformats.org/officeDocument/2006/relationships" xmlns:m="http://schemas.openxmlformats.org/officeDocument/2006/math" xmlns:v="urn:schemas-microsoft-com:vml" xmlns:wp14="http://schemas.microsoft.com/office/word/2010/wordprocessingDrawing" xmlns:wp="http://schemas.openxmlformats.org/drawingml/2006/wordprocessingDrawing" xmlns:w10="urn:schemas-microsoft-com:office:word" xmlns:w="http://schemas.openxmlformats.org/wordprocessingml/2006/main" xmlns:w14="http://schemas.microsoft.com/office/word/2010/wordml" xmlns:w15="http://schemas.microsoft.com/office/word/2012/wordml" xmlns:w16cex="http://schemas.microsoft.com/office/word/2018/wordml/cex" xmlns:w16cid="http://schemas.microsoft.com/office/word/2016/wordml/cid" xmlns:w16="http://schemas.microsoft.com/office/word/2018/wordml" xmlns:w16du="http://schemas.microsoft.com/office/word/2023/wordml/word16du" xmlns:w16sdtdh="http://schemas.microsoft.com/office/word/2020/wordml/sdtdatahash" xmlns:w16se="http://schemas.microsoft.com/office/word/2015/wordml/symex" xmlns:wpg="http://schemas.microsoft.com/office/word/2010/wordprocessingGroup" xmlns:wpi="http://schemas.microsoft.com/office/word/2010/wordprocessingInk" xmlns:wne="http://schemas.microsoft.com/office/word/2006/wordml" xmlns:wps="http://schemas.microsoft.com/office/word/2010/wordprocessingShape" mc:Ignorable="w14 w15 w16se w16cid w16 w16cex w16sdtdh w16du wp14">
+<w:ftr xmlns:wpc="http://schemas.microsoft.com/office/word/2010/wordprocessingCanvas" xmlns:cx="http://schemas.microsoft.com/office/drawing/2014/chartex" xmlns:cx1="http://schemas.microsoft.com/office/drawing/2015/9/8/chartex" xmlns:cx2="http://schemas.microsoft.com/office/drawing/2015/10/21/chartex" xmlns:cx3="http://schemas.microsoft.com/office/drawing/2016/5/9/chartex" xmlns:cx4="http://schemas.microsoft.com/office/drawing/2016/5/10/chartex" xmlns:cx5="http://schemas.microsoft.com/office/drawing/2016/5/11/chartex" xmlns:cx6="http://schemas.microsoft.com/office/drawing/2016/5/12/chartex" xmlns:cx7="http://schemas.microsoft.com/office/drawing/2016/5/13/chartex" xmlns:cx8="http://schemas.microsoft.com/office/drawing/2016/5/14/chartex" xmlns:mc="http://schemas.openxmlformats.org/markup-compatibility/2006" xmlns:aink="http://schemas.microsoft.com/office/drawing/2016/ink" xmlns:am3d="http://schemas.microsoft.com/office/drawing/2017/model3d" xmlns:o="urn:schemas-microsoft-com:office:office" xmlns:oel="http://schemas.microsoft.com/office/2019/extlst" xmlns:r="http://schemas.openxmlformats.org/officeDocument/2006/relationships" xmlns:m="http://schemas.openxmlformats.org/officeDocument/2006/math" xmlns:v="urn:schemas-microsoft-com:vml" xmlns:wp14="http://schemas.microsoft.com/office/word/2010/wordprocessingDrawing" xmlns:wp="http://schemas.openxmlformats.org/drawingml/2006/wordprocessingDrawing" xmlns:w10="urn:schemas-microsoft-com:office:word" xmlns:w="http://schemas.openxmlformats.org/wordprocessingml/2006/main" xmlns:w14="http://schemas.microsoft.com/office/word/2010/wordml" xmlns:w15="http://schemas.microsoft.com/office/word/2012/wordml" xmlns:w16cex="http://schemas.microsoft.com/office/word/2018/wordml/cex" xmlns:w16cid="http://schemas.microsoft.com/office/word/2016/wordml/cid" xmlns:w16="http://schemas.microsoft.com/office/word/2018/wordml" xmlns:w16du="http://schemas.microsoft.com/office/word/2023/wordml/word16du" xmlns:w16sdtdh="http://schemas.microsoft.com/office/word/2020/wordml/sdtdatahash" xmlns:w16sdtfl="http://schemas.microsoft.com/office/word/2024/wordml/sdtformatlock" xmlns:w16se="http://schemas.microsoft.com/office/word/2015/wordml/symex" xmlns:wpg="http://schemas.microsoft.com/office/word/2010/wordprocessingGroup" xmlns:wpi="http://schemas.microsoft.com/office/word/2010/wordprocessingInk" xmlns:wne="http://schemas.microsoft.com/office/word/2006/wordml" xmlns:wps="http://schemas.microsoft.com/office/word/2010/wordprocessingShape" mc:Ignorable="w14 w15 w16se w16cid w16 w16cex w16sdtdh w16sdtfl w16du wp14">
   <w:p>
     <w:pPr>
       <w:pStyle w:val="Piedepgina"/>
@@ -293,7 +734,7 @@
 </file>
 
 <file path=word/footnotes.xml><?xml version="1.0" encoding="utf-8"?>
-<w:footnotes xmlns:wpc="http://schemas.microsoft.com/office/word/2010/wordprocessingCanvas" xmlns:cx="http://schemas.microsoft.com/office/drawing/2014/chartex" xmlns:cx1="http://schemas.microsoft.com/office/drawing/2015/9/8/chartex" xmlns:cx2="http://schemas.microsoft.com/office/drawing/2015/10/21/chartex" xmlns:cx3="http://schemas.microsoft.com/office/drawing/2016/5/9/chartex" xmlns:cx4="http://schemas.microsoft.com/office/drawing/2016/5/10/chartex" xmlns:cx5="http://schemas.microsoft.com/office/drawing/2016/5/11/chartex" xmlns:cx6="http://schemas.microsoft.com/office/drawing/2016/5/12/chartex" xmlns:cx7="http://schemas.microsoft.com/office/drawing/2016/5/13/chartex" xmlns:cx8="http://schemas.microsoft.com/office/drawing/2016/5/14/chartex" xmlns:mc="http://schemas.openxmlformats.org/markup-compatibility/2006" xmlns:aink="http://schemas.microsoft.com/office/drawing/2016/ink" xmlns:am3d="http://schemas.microsoft.com/office/drawing/2017/model3d" xmlns:o="urn:schemas-microsoft-com:office:office" xmlns:oel="http://schemas.microsoft.com/office/2019/extlst" xmlns:r="http://schemas.openxmlformats.org/officeDocument/2006/relationships" xmlns:m="http://schemas.openxmlformats.org/officeDocument/2006/math" xmlns:v="urn:schemas-microsoft-com:vml" xmlns:wp14="http://schemas.microsoft.com/office/word/2010/wordprocessingDrawing" xmlns:wp="http://schemas.openxmlformats.org/drawingml/2006/wordprocessingDrawing" xmlns:w10="urn:schemas-microsoft-com:office:word" xmlns:w="http://schemas.openxmlformats.org/wordprocessingml/2006/main" xmlns:w14="http://schemas.microsoft.com/office/word/2010/wordml" xmlns:w15="http://schemas.microsoft.com/office/word/2012/wordml" xmlns:w16cex="http://schemas.microsoft.com/office/word/2018/wordml/cex" xmlns:w16cid="http://schemas.microsoft.com/office/word/2016/wordml/cid" xmlns:w16="http://schemas.microsoft.com/office/word/2018/wordml" xmlns:w16du="http://schemas.microsoft.com/office/word/2023/wordml/word16du" xmlns:w16sdtdh="http://schemas.microsoft.com/office/word/2020/wordml/sdtdatahash" xmlns:w16se="http://schemas.microsoft.com/office/word/2015/wordml/symex" xmlns:wpg="http://schemas.microsoft.com/office/word/2010/wordprocessingGroup" xmlns:wpi="http://schemas.microsoft.com/office/word/2010/wordprocessingInk" xmlns:wne="http://schemas.microsoft.com/office/word/2006/wordml" xmlns:wps="http://schemas.microsoft.com/office/word/2010/wordprocessingShape" mc:Ignorable="w14 w15 w16se w16cid w16 w16cex w16sdtdh w16du wp14">
+<w:footnotes xmlns:wpc="http://schemas.microsoft.com/office/word/2010/wordprocessingCanvas" xmlns:cx="http://schemas.microsoft.com/office/drawing/2014/chartex" xmlns:cx1="http://schemas.microsoft.com/office/drawing/2015/9/8/chartex" xmlns:cx2="http://schemas.microsoft.com/office/drawing/2015/10/21/chartex" xmlns:cx3="http://schemas.microsoft.com/office/drawing/2016/5/9/chartex" xmlns:cx4="http://schemas.microsoft.com/office/drawing/2016/5/10/chartex" xmlns:cx5="http://schemas.microsoft.com/office/drawing/2016/5/11/chartex" xmlns:cx6="http://schemas.microsoft.com/office/drawing/2016/5/12/chartex" xmlns:cx7="http://schemas.microsoft.com/office/drawing/2016/5/13/chartex" xmlns:cx8="http://schemas.microsoft.com/office/drawing/2016/5/14/chartex" xmlns:mc="http://schemas.openxmlformats.org/markup-compatibility/2006" xmlns:aink="http://schemas.microsoft.com/office/drawing/2016/ink" xmlns:am3d="http://schemas.microsoft.com/office/drawing/2017/model3d" xmlns:o="urn:schemas-microsoft-com:office:office" xmlns:oel="http://schemas.microsoft.com/office/2019/extlst" xmlns:r="http://schemas.openxmlformats.org/officeDocument/2006/relationships" xmlns:m="http://schemas.openxmlformats.org/officeDocument/2006/math" xmlns:v="urn:schemas-microsoft-com:vml" xmlns:wp14="http://schemas.microsoft.com/office/word/2010/wordprocessingDrawing" xmlns:wp="http://schemas.openxmlformats.org/drawingml/2006/wordprocessingDrawing" xmlns:w10="urn:schemas-microsoft-com:office:word" xmlns:w="http://schemas.openxmlformats.org/wordprocessingml/2006/main" xmlns:w14="http://schemas.microsoft.com/office/word/2010/wordml" xmlns:w15="http://schemas.microsoft.com/office/word/2012/wordml" xmlns:w16cex="http://schemas.microsoft.com/office/word/2018/wordml/cex" xmlns:w16cid="http://schemas.microsoft.com/office/word/2016/wordml/cid" xmlns:w16="http://schemas.microsoft.com/office/word/2018/wordml" xmlns:w16du="http://schemas.microsoft.com/office/word/2023/wordml/word16du" xmlns:w16sdtdh="http://schemas.microsoft.com/office/word/2020/wordml/sdtdatahash" xmlns:w16sdtfl="http://schemas.microsoft.com/office/word/2024/wordml/sdtformatlock" xmlns:w16se="http://schemas.microsoft.com/office/word/2015/wordml/symex" xmlns:wpg="http://schemas.microsoft.com/office/word/2010/wordprocessingGroup" xmlns:wpi="http://schemas.microsoft.com/office/word/2010/wordprocessingInk" xmlns:wne="http://schemas.microsoft.com/office/word/2006/wordml" xmlns:wps="http://schemas.microsoft.com/office/word/2010/wordprocessingShape" mc:Ignorable="w14 w15 w16se w16cid w16 w16cex w16sdtdh w16sdtfl w16du wp14">
   <w:footnote w:type="separator" w:id="-1">
     <w:p>
       <w:pPr>
@@ -318,7 +759,7 @@
 </file>
 
 <file path=word/header1.xml><?xml version="1.0" encoding="utf-8"?>
-<w:hdr xmlns:wpc="http://schemas.microsoft.com/office/word/2010/wordprocessingCanvas" xmlns:cx="http://schemas.microsoft.com/office/drawing/2014/chartex" xmlns:cx1="http://schemas.microsoft.com/office/drawing/2015/9/8/chartex" xmlns:cx2="http://schemas.microsoft.com/office/drawing/2015/10/21/chartex" xmlns:cx3="http://schemas.microsoft.com/office/drawing/2016/5/9/chartex" xmlns:cx4="http://schemas.microsoft.com/office/drawing/2016/5/10/chartex" xmlns:cx5="http://schemas.microsoft.com/office/drawing/2016/5/11/chartex" xmlns:cx6="http://schemas.microsoft.com/office/drawing/2016/5/12/chartex" xmlns:cx7="http://schemas.microsoft.com/office/drawing/2016/5/13/chartex" xmlns:cx8="http://schemas.microsoft.com/office/drawing/2016/5/14/chartex" xmlns:mc="http://schemas.openxmlformats.org/markup-compatibility/2006" xmlns:aink="http://schemas.microsoft.com/office/drawing/2016/ink" xmlns:am3d="http://schemas.microsoft.com/office/drawing/2017/model3d" xmlns:o="urn:schemas-microsoft-com:office:office" xmlns:oel="http://schemas.microsoft.com/office/2019/extlst" xmlns:r="http://schemas.openxmlformats.org/officeDocument/2006/relationships" xmlns:m="http://schemas.openxmlformats.org/officeDocument/2006/math" xmlns:v="urn:schemas-microsoft-com:vml" xmlns:wp14="http://schemas.microsoft.com/office/word/2010/wordprocessingDrawing" xmlns:wp="http://schemas.openxmlformats.org/drawingml/2006/wordprocessingDrawing" xmlns:w10="urn:schemas-microsoft-com:office:word" xmlns:w="http://schemas.openxmlformats.org/wordprocessingml/2006/main" xmlns:w14="http://schemas.microsoft.com/office/word/2010/wordml" xmlns:w15="http://schemas.microsoft.com/office/word/2012/wordml" xmlns:w16cex="http://schemas.microsoft.com/office/word/2018/wordml/cex" xmlns:w16cid="http://schemas.microsoft.com/office/word/2016/wordml/cid" xmlns:w16="http://schemas.microsoft.com/office/word/2018/wordml" xmlns:w16du="http://schemas.microsoft.com/office/word/2023/wordml/word16du" xmlns:w16sdtdh="http://schemas.microsoft.com/office/word/2020/wordml/sdtdatahash" xmlns:w16se="http://schemas.microsoft.com/office/word/2015/wordml/symex" xmlns:wpg="http://schemas.microsoft.com/office/word/2010/wordprocessingGroup" xmlns:wpi="http://schemas.microsoft.com/office/word/2010/wordprocessingInk" xmlns:wne="http://schemas.microsoft.com/office/word/2006/wordml" xmlns:wps="http://schemas.microsoft.com/office/word/2010/wordprocessingShape" mc:Ignorable="w14 w15 w16se w16cid w16 w16cex w16sdtdh w16du wp14">
+<w:hdr xmlns:wpc="http://schemas.microsoft.com/office/word/2010/wordprocessingCanvas" xmlns:cx="http://schemas.microsoft.com/office/drawing/2014/chartex" xmlns:cx1="http://schemas.microsoft.com/office/drawing/2015/9/8/chartex" xmlns:cx2="http://schemas.microsoft.com/office/drawing/2015/10/21/chartex" xmlns:cx3="http://schemas.microsoft.com/office/drawing/2016/5/9/chartex" xmlns:cx4="http://schemas.microsoft.com/office/drawing/2016/5/10/chartex" xmlns:cx5="http://schemas.microsoft.com/office/drawing/2016/5/11/chartex" xmlns:cx6="http://schemas.microsoft.com/office/drawing/2016/5/12/chartex" xmlns:cx7="http://schemas.microsoft.com/office/drawing/2016/5/13/chartex" xmlns:cx8="http://schemas.microsoft.com/office/drawing/2016/5/14/chartex" xmlns:mc="http://schemas.openxmlformats.org/markup-compatibility/2006" xmlns:aink="http://schemas.microsoft.com/office/drawing/2016/ink" xmlns:am3d="http://schemas.microsoft.com/office/drawing/2017/model3d" xmlns:o="urn:schemas-microsoft-com:office:office" xmlns:oel="http://schemas.microsoft.com/office/2019/extlst" xmlns:r="http://schemas.openxmlformats.org/officeDocument/2006/relationships" xmlns:m="http://schemas.openxmlformats.org/officeDocument/2006/math" xmlns:v="urn:schemas-microsoft-com:vml" xmlns:wp14="http://schemas.microsoft.com/office/word/2010/wordprocessingDrawing" xmlns:wp="http://schemas.openxmlformats.org/drawingml/2006/wordprocessingDrawing" xmlns:w10="urn:schemas-microsoft-com:office:word" xmlns:w="http://schemas.openxmlformats.org/wordprocessingml/2006/main" xmlns:w14="http://schemas.microsoft.com/office/word/2010/wordml" xmlns:w15="http://schemas.microsoft.com/office/word/2012/wordml" xmlns:w16cex="http://schemas.microsoft.com/office/word/2018/wordml/cex" xmlns:w16cid="http://schemas.microsoft.com/office/word/2016/wordml/cid" xmlns:w16="http://schemas.microsoft.com/office/word/2018/wordml" xmlns:w16du="http://schemas.microsoft.com/office/word/2023/wordml/word16du" xmlns:w16sdtdh="http://schemas.microsoft.com/office/word/2020/wordml/sdtdatahash" xmlns:w16sdtfl="http://schemas.microsoft.com/office/word/2024/wordml/sdtformatlock" xmlns:w16se="http://schemas.microsoft.com/office/word/2015/wordml/symex" xmlns:wpg="http://schemas.microsoft.com/office/word/2010/wordprocessingGroup" xmlns:wpi="http://schemas.microsoft.com/office/word/2010/wordprocessingInk" xmlns:wne="http://schemas.microsoft.com/office/word/2006/wordml" xmlns:wps="http://schemas.microsoft.com/office/word/2010/wordprocessingShape" mc:Ignorable="w14 w15 w16se w16cid w16 w16cex w16sdtdh w16sdtfl w16du wp14">
   <w:p>
     <w:r>
       <w:rPr>
@@ -385,7 +826,7 @@
 </file>
 
 <file path=word/numbering.xml><?xml version="1.0" encoding="utf-8"?>
-<w:numbering xmlns:wpc="http://schemas.microsoft.com/office/word/2010/wordprocessingCanvas" xmlns:cx="http://schemas.microsoft.com/office/drawing/2014/chartex" xmlns:cx1="http://schemas.microsoft.com/office/drawing/2015/9/8/chartex" xmlns:cx2="http://schemas.microsoft.com/office/drawing/2015/10/21/chartex" xmlns:cx3="http://schemas.microsoft.com/office/drawing/2016/5/9/chartex" xmlns:cx4="http://schemas.microsoft.com/office/drawing/2016/5/10/chartex" xmlns:cx5="http://schemas.microsoft.com/office/drawing/2016/5/11/chartex" xmlns:cx6="http://schemas.microsoft.com/office/drawing/2016/5/12/chartex" xmlns:cx7="http://schemas.microsoft.com/office/drawing/2016/5/13/chartex" xmlns:cx8="http://schemas.microsoft.com/office/drawing/2016/5/14/chartex" xmlns:mc="http://schemas.openxmlformats.org/markup-compatibility/2006" xmlns:aink="http://schemas.microsoft.com/office/drawing/2016/ink" xmlns:am3d="http://schemas.microsoft.com/office/drawing/2017/model3d" xmlns:o="urn:schemas-microsoft-com:office:office" xmlns:oel="http://schemas.microsoft.com/office/2019/extlst" xmlns:r="http://schemas.openxmlformats.org/officeDocument/2006/relationships" xmlns:m="http://schemas.openxmlformats.org/officeDocument/2006/math" xmlns:v="urn:schemas-microsoft-com:vml" xmlns:wp14="http://schemas.microsoft.com/office/word/2010/wordprocessingDrawing" xmlns:wp="http://schemas.openxmlformats.org/drawingml/2006/wordprocessingDrawing" xmlns:w10="urn:schemas-microsoft-com:office:word" xmlns:w="http://schemas.openxmlformats.org/wordprocessingml/2006/main" xmlns:w14="http://schemas.microsoft.com/office/word/2010/wordml" xmlns:w15="http://schemas.microsoft.com/office/word/2012/wordml" xmlns:w16cex="http://schemas.microsoft.com/office/word/2018/wordml/cex" xmlns:w16cid="http://schemas.microsoft.com/office/word/2016/wordml/cid" xmlns:w16="http://schemas.microsoft.com/office/word/2018/wordml" xmlns:w16du="http://schemas.microsoft.com/office/word/2023/wordml/word16du" xmlns:w16sdtdh="http://schemas.microsoft.com/office/word/2020/wordml/sdtdatahash" xmlns:w16se="http://schemas.microsoft.com/office/word/2015/wordml/symex" xmlns:wpg="http://schemas.microsoft.com/office/word/2010/wordprocessingGroup" xmlns:wpi="http://schemas.microsoft.com/office/word/2010/wordprocessingInk" xmlns:wne="http://schemas.microsoft.com/office/word/2006/wordml" xmlns:wps="http://schemas.microsoft.com/office/word/2010/wordprocessingShape" mc:Ignorable="w14 w15 w16se w16cid w16 w16cex w16sdtdh w16du wp14">
+<w:numbering xmlns:wpc="http://schemas.microsoft.com/office/word/2010/wordprocessingCanvas" xmlns:cx="http://schemas.microsoft.com/office/drawing/2014/chartex" xmlns:cx1="http://schemas.microsoft.com/office/drawing/2015/9/8/chartex" xmlns:cx2="http://schemas.microsoft.com/office/drawing/2015/10/21/chartex" xmlns:cx3="http://schemas.microsoft.com/office/drawing/2016/5/9/chartex" xmlns:cx4="http://schemas.microsoft.com/office/drawing/2016/5/10/chartex" xmlns:cx5="http://schemas.microsoft.com/office/drawing/2016/5/11/chartex" xmlns:cx6="http://schemas.microsoft.com/office/drawing/2016/5/12/chartex" xmlns:cx7="http://schemas.microsoft.com/office/drawing/2016/5/13/chartex" xmlns:cx8="http://schemas.microsoft.com/office/drawing/2016/5/14/chartex" xmlns:mc="http://schemas.openxmlformats.org/markup-compatibility/2006" xmlns:aink="http://schemas.microsoft.com/office/drawing/2016/ink" xmlns:am3d="http://schemas.microsoft.com/office/drawing/2017/model3d" xmlns:o="urn:schemas-microsoft-com:office:office" xmlns:oel="http://schemas.microsoft.com/office/2019/extlst" xmlns:r="http://schemas.openxmlformats.org/officeDocument/2006/relationships" xmlns:m="http://schemas.openxmlformats.org/officeDocument/2006/math" xmlns:v="urn:schemas-microsoft-com:vml" xmlns:wp14="http://schemas.microsoft.com/office/word/2010/wordprocessingDrawing" xmlns:wp="http://schemas.openxmlformats.org/drawingml/2006/wordprocessingDrawing" xmlns:w10="urn:schemas-microsoft-com:office:word" xmlns:w="http://schemas.openxmlformats.org/wordprocessingml/2006/main" xmlns:w14="http://schemas.microsoft.com/office/word/2010/wordml" xmlns:w15="http://schemas.microsoft.com/office/word/2012/wordml" xmlns:w16cex="http://schemas.microsoft.com/office/word/2018/wordml/cex" xmlns:w16cid="http://schemas.microsoft.com/office/word/2016/wordml/cid" xmlns:w16="http://schemas.microsoft.com/office/word/2018/wordml" xmlns:w16du="http://schemas.microsoft.com/office/word/2023/wordml/word16du" xmlns:w16sdtdh="http://schemas.microsoft.com/office/word/2020/wordml/sdtdatahash" xmlns:w16sdtfl="http://schemas.microsoft.com/office/word/2024/wordml/sdtformatlock" xmlns:w16se="http://schemas.microsoft.com/office/word/2015/wordml/symex" xmlns:wpg="http://schemas.microsoft.com/office/word/2010/wordprocessingGroup" xmlns:wpi="http://schemas.microsoft.com/office/word/2010/wordprocessingInk" xmlns:wne="http://schemas.microsoft.com/office/word/2006/wordml" xmlns:wps="http://schemas.microsoft.com/office/word/2010/wordprocessingShape" mc:Ignorable="w14 w15 w16se w16cid w16 w16cex w16sdtdh w16sdtfl w16du wp14">
   <w:abstractNum w:abstractNumId="0" w15:restartNumberingAfterBreak="0">
     <w:nsid w:val="6BB95A3E"/>
     <w:multiLevelType w:val="multilevel"/>
@@ -506,7 +947,7 @@
 </file>
 
 <file path=word/styles.xml><?xml version="1.0" encoding="utf-8"?>
-<w:styles xmlns:mc="http://schemas.openxmlformats.org/markup-compatibility/2006" xmlns:r="http://schemas.openxmlformats.org/officeDocument/2006/relationships" xmlns:w="http://schemas.openxmlformats.org/wordprocessingml/2006/main" xmlns:w14="http://schemas.microsoft.com/office/word/2010/wordml" xmlns:w15="http://schemas.microsoft.com/office/word/2012/wordml" xmlns:w16cex="http://schemas.microsoft.com/office/word/2018/wordml/cex" xmlns:w16cid="http://schemas.microsoft.com/office/word/2016/wordml/cid" xmlns:w16="http://schemas.microsoft.com/office/word/2018/wordml" xmlns:w16du="http://schemas.microsoft.com/office/word/2023/wordml/word16du" xmlns:w16sdtdh="http://schemas.microsoft.com/office/word/2020/wordml/sdtdatahash" xmlns:w16se="http://schemas.microsoft.com/office/word/2015/wordml/symex" mc:Ignorable="w14 w15 w16se w16cid w16 w16cex w16sdtdh w16du">
+<w:styles xmlns:mc="http://schemas.openxmlformats.org/markup-compatibility/2006" xmlns:r="http://schemas.openxmlformats.org/officeDocument/2006/relationships" xmlns:w="http://schemas.openxmlformats.org/wordprocessingml/2006/main" xmlns:w14="http://schemas.microsoft.com/office/word/2010/wordml" xmlns:w15="http://schemas.microsoft.com/office/word/2012/wordml" xmlns:w16cex="http://schemas.microsoft.com/office/word/2018/wordml/cex" xmlns:w16cid="http://schemas.microsoft.com/office/word/2016/wordml/cid" xmlns:w16="http://schemas.microsoft.com/office/word/2018/wordml" xmlns:w16du="http://schemas.microsoft.com/office/word/2023/wordml/word16du" xmlns:w16sdtdh="http://schemas.microsoft.com/office/word/2020/wordml/sdtdatahash" xmlns:w16sdtfl="http://schemas.microsoft.com/office/word/2024/wordml/sdtformatlock" xmlns:w16se="http://schemas.microsoft.com/office/word/2015/wordml/symex" mc:Ignorable="w14 w15 w16se w16cid w16 w16cex w16sdtdh w16sdtfl w16du">
   <w:docDefaults>
     <w:rPrDefault>
       <w:rPr>

</xml_diff>